<commit_message>
fix(toc): render entry text before the page number in cached TOC
The PAGEREF field runs were emitted as direct paragraph runs before the
hyperlink, so viewers showing the cached field result displayed the
placeholder page number as a leading '0' ('0 Introduction'). Word's
canonical TOC layout wraps the whole entry — text, tab, and PAGEREF
field — inside the w:hyperlink, and the TOC field's closing character
follows inside the last entry. Move the field inside the hyperlink so
cached entries read 'Heading ........ 0' and field nesting stays
ordered (TOC begin -> PAGEREF begin/end ... -> TOC end).
</commit_message>
<xml_diff>
--- a/examples/12-table-of-contents/output.docx
+++ b/examples/12-table-of-contents/output.docx
@@ -51,36 +51,6 @@
           <w:noProof/>
         </w:rPr>
       </w:pPr>
-      <w:r>
-        <w:rPr>
-          <w:noProof/>
-        </w:rPr>
-        <w:fldChar w:fldCharType="begin"/>
-      </w:r>
-      <w:r>
-        <w:rPr>
-          <w:noProof/>
-        </w:rPr>
-        <w:instrText xml:space="preserve"> PAGEREF _Toc00000000 \h </w:instrText>
-      </w:r>
-      <w:r>
-        <w:rPr>
-          <w:noProof/>
-        </w:rPr>
-        <w:fldChar w:fldCharType="separate"/>
-      </w:r>
-      <w:r>
-        <w:rPr>
-          <w:noProof/>
-        </w:rPr>
-        <w:t>0</w:t>
-      </w:r>
-      <w:r>
-        <w:rPr>
-          <w:noProof/>
-        </w:rPr>
-        <w:fldChar w:fldCharType="end"/>
-      </w:r>
       <w:hyperlink w:anchor="_Toc00000000" w:history="1">
         <w:r>
           <w:rPr>
@@ -93,6 +63,36 @@
             <w:noProof/>
           </w:rPr>
           <w:tab/>
+        </w:r>
+        <w:r>
+          <w:rPr>
+            <w:noProof/>
+          </w:rPr>
+          <w:fldChar w:fldCharType="begin"/>
+        </w:r>
+        <w:r>
+          <w:rPr>
+            <w:noProof/>
+          </w:rPr>
+          <w:instrText xml:space="preserve"> PAGEREF _Toc00000000 \h </w:instrText>
+        </w:r>
+        <w:r>
+          <w:rPr>
+            <w:noProof/>
+          </w:rPr>
+          <w:fldChar w:fldCharType="separate"/>
+        </w:r>
+        <w:r>
+          <w:rPr>
+            <w:noProof/>
+          </w:rPr>
+          <w:t>0</w:t>
+        </w:r>
+        <w:r>
+          <w:rPr>
+            <w:noProof/>
+          </w:rPr>
+          <w:fldChar w:fldCharType="end"/>
         </w:r>
       </w:hyperlink>
     </w:p>
@@ -107,36 +107,6 @@
           <w:noProof/>
         </w:rPr>
       </w:pPr>
-      <w:r>
-        <w:rPr>
-          <w:noProof/>
-        </w:rPr>
-        <w:fldChar w:fldCharType="begin"/>
-      </w:r>
-      <w:r>
-        <w:rPr>
-          <w:noProof/>
-        </w:rPr>
-        <w:instrText xml:space="preserve"> PAGEREF _Toc00000001 \h </w:instrText>
-      </w:r>
-      <w:r>
-        <w:rPr>
-          <w:noProof/>
-        </w:rPr>
-        <w:fldChar w:fldCharType="separate"/>
-      </w:r>
-      <w:r>
-        <w:rPr>
-          <w:noProof/>
-        </w:rPr>
-        <w:t>0</w:t>
-      </w:r>
-      <w:r>
-        <w:rPr>
-          <w:noProof/>
-        </w:rPr>
-        <w:fldChar w:fldCharType="end"/>
-      </w:r>
       <w:hyperlink w:anchor="_Toc00000001" w:history="1">
         <w:r>
           <w:rPr>
@@ -149,6 +119,36 @@
             <w:noProof/>
           </w:rPr>
           <w:tab/>
+        </w:r>
+        <w:r>
+          <w:rPr>
+            <w:noProof/>
+          </w:rPr>
+          <w:fldChar w:fldCharType="begin"/>
+        </w:r>
+        <w:r>
+          <w:rPr>
+            <w:noProof/>
+          </w:rPr>
+          <w:instrText xml:space="preserve"> PAGEREF _Toc00000001 \h </w:instrText>
+        </w:r>
+        <w:r>
+          <w:rPr>
+            <w:noProof/>
+          </w:rPr>
+          <w:fldChar w:fldCharType="separate"/>
+        </w:r>
+        <w:r>
+          <w:rPr>
+            <w:noProof/>
+          </w:rPr>
+          <w:t>0</w:t>
+        </w:r>
+        <w:r>
+          <w:rPr>
+            <w:noProof/>
+          </w:rPr>
+          <w:fldChar w:fldCharType="end"/>
         </w:r>
       </w:hyperlink>
     </w:p>
@@ -163,36 +163,6 @@
           <w:noProof/>
         </w:rPr>
       </w:pPr>
-      <w:r>
-        <w:rPr>
-          <w:noProof/>
-        </w:rPr>
-        <w:fldChar w:fldCharType="begin"/>
-      </w:r>
-      <w:r>
-        <w:rPr>
-          <w:noProof/>
-        </w:rPr>
-        <w:instrText xml:space="preserve"> PAGEREF _Toc00000002 \h </w:instrText>
-      </w:r>
-      <w:r>
-        <w:rPr>
-          <w:noProof/>
-        </w:rPr>
-        <w:fldChar w:fldCharType="separate"/>
-      </w:r>
-      <w:r>
-        <w:rPr>
-          <w:noProof/>
-        </w:rPr>
-        <w:t>0</w:t>
-      </w:r>
-      <w:r>
-        <w:rPr>
-          <w:noProof/>
-        </w:rPr>
-        <w:fldChar w:fldCharType="end"/>
-      </w:r>
       <w:hyperlink w:anchor="_Toc00000002" w:history="1">
         <w:r>
           <w:rPr>
@@ -205,6 +175,36 @@
             <w:noProof/>
           </w:rPr>
           <w:tab/>
+        </w:r>
+        <w:r>
+          <w:rPr>
+            <w:noProof/>
+          </w:rPr>
+          <w:fldChar w:fldCharType="begin"/>
+        </w:r>
+        <w:r>
+          <w:rPr>
+            <w:noProof/>
+          </w:rPr>
+          <w:instrText xml:space="preserve"> PAGEREF _Toc00000002 \h </w:instrText>
+        </w:r>
+        <w:r>
+          <w:rPr>
+            <w:noProof/>
+          </w:rPr>
+          <w:fldChar w:fldCharType="separate"/>
+        </w:r>
+        <w:r>
+          <w:rPr>
+            <w:noProof/>
+          </w:rPr>
+          <w:t>0</w:t>
+        </w:r>
+        <w:r>
+          <w:rPr>
+            <w:noProof/>
+          </w:rPr>
+          <w:fldChar w:fldCharType="end"/>
         </w:r>
       </w:hyperlink>
     </w:p>
@@ -219,36 +219,6 @@
           <w:noProof/>
         </w:rPr>
       </w:pPr>
-      <w:r>
-        <w:rPr>
-          <w:noProof/>
-        </w:rPr>
-        <w:fldChar w:fldCharType="begin"/>
-      </w:r>
-      <w:r>
-        <w:rPr>
-          <w:noProof/>
-        </w:rPr>
-        <w:instrText xml:space="preserve"> PAGEREF _Toc00000003 \h </w:instrText>
-      </w:r>
-      <w:r>
-        <w:rPr>
-          <w:noProof/>
-        </w:rPr>
-        <w:fldChar w:fldCharType="separate"/>
-      </w:r>
-      <w:r>
-        <w:rPr>
-          <w:noProof/>
-        </w:rPr>
-        <w:t>0</w:t>
-      </w:r>
-      <w:r>
-        <w:rPr>
-          <w:noProof/>
-        </w:rPr>
-        <w:fldChar w:fldCharType="end"/>
-      </w:r>
       <w:hyperlink w:anchor="_Toc00000003" w:history="1">
         <w:r>
           <w:rPr>
@@ -261,6 +231,36 @@
             <w:noProof/>
           </w:rPr>
           <w:tab/>
+        </w:r>
+        <w:r>
+          <w:rPr>
+            <w:noProof/>
+          </w:rPr>
+          <w:fldChar w:fldCharType="begin"/>
+        </w:r>
+        <w:r>
+          <w:rPr>
+            <w:noProof/>
+          </w:rPr>
+          <w:instrText xml:space="preserve"> PAGEREF _Toc00000003 \h </w:instrText>
+        </w:r>
+        <w:r>
+          <w:rPr>
+            <w:noProof/>
+          </w:rPr>
+          <w:fldChar w:fldCharType="separate"/>
+        </w:r>
+        <w:r>
+          <w:rPr>
+            <w:noProof/>
+          </w:rPr>
+          <w:t>0</w:t>
+        </w:r>
+        <w:r>
+          <w:rPr>
+            <w:noProof/>
+          </w:rPr>
+          <w:fldChar w:fldCharType="end"/>
         </w:r>
       </w:hyperlink>
     </w:p>
@@ -275,39 +275,6 @@
           <w:noProof/>
         </w:rPr>
       </w:pPr>
-      <w:r>
-        <w:rPr>
-          <w:noProof/>
-        </w:rPr>
-        <w:fldChar w:fldCharType="begin"/>
-      </w:r>
-      <w:r>
-        <w:rPr>
-          <w:noProof/>
-        </w:rPr>
-        <w:instrText xml:space="preserve"> PAGEREF _Toc00000004 \h </w:instrText>
-      </w:r>
-      <w:r>
-        <w:rPr>
-          <w:noProof/>
-        </w:rPr>
-        <w:fldChar w:fldCharType="separate"/>
-      </w:r>
-      <w:r>
-        <w:rPr>
-          <w:noProof/>
-        </w:rPr>
-        <w:t>0</w:t>
-      </w:r>
-      <w:r>
-        <w:rPr>
-          <w:noProof/>
-        </w:rPr>
-        <w:fldChar w:fldCharType="end"/>
-      </w:r>
-      <w:r>
-        <w:fldChar w:fldCharType="end"/>
-      </w:r>
       <w:hyperlink w:anchor="_Toc00000004" w:history="1">
         <w:r>
           <w:rPr>
@@ -320,6 +287,39 @@
             <w:noProof/>
           </w:rPr>
           <w:tab/>
+        </w:r>
+        <w:r>
+          <w:rPr>
+            <w:noProof/>
+          </w:rPr>
+          <w:fldChar w:fldCharType="begin"/>
+        </w:r>
+        <w:r>
+          <w:rPr>
+            <w:noProof/>
+          </w:rPr>
+          <w:instrText xml:space="preserve"> PAGEREF _Toc00000004 \h </w:instrText>
+        </w:r>
+        <w:r>
+          <w:rPr>
+            <w:noProof/>
+          </w:rPr>
+          <w:fldChar w:fldCharType="separate"/>
+        </w:r>
+        <w:r>
+          <w:rPr>
+            <w:noProof/>
+          </w:rPr>
+          <w:t>0</w:t>
+        </w:r>
+        <w:r>
+          <w:rPr>
+            <w:noProof/>
+          </w:rPr>
+          <w:fldChar w:fldCharType="end"/>
+        </w:r>
+        <w:r>
+          <w:fldChar w:fldCharType="end"/>
         </w:r>
       </w:hyperlink>
     </w:p>
@@ -452,36 +452,6 @@
           <w:noProof/>
         </w:rPr>
       </w:pPr>
-      <w:r>
-        <w:rPr>
-          <w:noProof/>
-        </w:rPr>
-        <w:fldChar w:fldCharType="begin"/>
-      </w:r>
-      <w:r>
-        <w:rPr>
-          <w:noProof/>
-        </w:rPr>
-        <w:instrText xml:space="preserve"> PAGEREF _Toc00000005 \h </w:instrText>
-      </w:r>
-      <w:r>
-        <w:rPr>
-          <w:noProof/>
-        </w:rPr>
-        <w:fldChar w:fldCharType="separate"/>
-      </w:r>
-      <w:r>
-        <w:rPr>
-          <w:noProof/>
-        </w:rPr>
-        <w:t>0</w:t>
-      </w:r>
-      <w:r>
-        <w:rPr>
-          <w:noProof/>
-        </w:rPr>
-        <w:fldChar w:fldCharType="end"/>
-      </w:r>
       <w:hyperlink w:anchor="_Toc00000005" w:history="1">
         <w:r>
           <w:rPr>
@@ -494,6 +464,36 @@
             <w:noProof/>
           </w:rPr>
           <w:tab/>
+        </w:r>
+        <w:r>
+          <w:rPr>
+            <w:noProof/>
+          </w:rPr>
+          <w:fldChar w:fldCharType="begin"/>
+        </w:r>
+        <w:r>
+          <w:rPr>
+            <w:noProof/>
+          </w:rPr>
+          <w:instrText xml:space="preserve"> PAGEREF _Toc00000005 \h </w:instrText>
+        </w:r>
+        <w:r>
+          <w:rPr>
+            <w:noProof/>
+          </w:rPr>
+          <w:fldChar w:fldCharType="separate"/>
+        </w:r>
+        <w:r>
+          <w:rPr>
+            <w:noProof/>
+          </w:rPr>
+          <w:t>0</w:t>
+        </w:r>
+        <w:r>
+          <w:rPr>
+            <w:noProof/>
+          </w:rPr>
+          <w:fldChar w:fldCharType="end"/>
         </w:r>
       </w:hyperlink>
     </w:p>
@@ -508,36 +508,6 @@
           <w:noProof/>
         </w:rPr>
       </w:pPr>
-      <w:r>
-        <w:rPr>
-          <w:noProof/>
-        </w:rPr>
-        <w:fldChar w:fldCharType="begin"/>
-      </w:r>
-      <w:r>
-        <w:rPr>
-          <w:noProof/>
-        </w:rPr>
-        <w:instrText xml:space="preserve"> PAGEREF _Toc00000006 \h </w:instrText>
-      </w:r>
-      <w:r>
-        <w:rPr>
-          <w:noProof/>
-        </w:rPr>
-        <w:fldChar w:fldCharType="separate"/>
-      </w:r>
-      <w:r>
-        <w:rPr>
-          <w:noProof/>
-        </w:rPr>
-        <w:t>0</w:t>
-      </w:r>
-      <w:r>
-        <w:rPr>
-          <w:noProof/>
-        </w:rPr>
-        <w:fldChar w:fldCharType="end"/>
-      </w:r>
       <w:hyperlink w:anchor="_Toc00000006" w:history="1">
         <w:r>
           <w:rPr>
@@ -550,6 +520,36 @@
             <w:noProof/>
           </w:rPr>
           <w:tab/>
+        </w:r>
+        <w:r>
+          <w:rPr>
+            <w:noProof/>
+          </w:rPr>
+          <w:fldChar w:fldCharType="begin"/>
+        </w:r>
+        <w:r>
+          <w:rPr>
+            <w:noProof/>
+          </w:rPr>
+          <w:instrText xml:space="preserve"> PAGEREF _Toc00000006 \h </w:instrText>
+        </w:r>
+        <w:r>
+          <w:rPr>
+            <w:noProof/>
+          </w:rPr>
+          <w:fldChar w:fldCharType="separate"/>
+        </w:r>
+        <w:r>
+          <w:rPr>
+            <w:noProof/>
+          </w:rPr>
+          <w:t>0</w:t>
+        </w:r>
+        <w:r>
+          <w:rPr>
+            <w:noProof/>
+          </w:rPr>
+          <w:fldChar w:fldCharType="end"/>
         </w:r>
       </w:hyperlink>
     </w:p>
@@ -564,36 +564,6 @@
           <w:noProof/>
         </w:rPr>
       </w:pPr>
-      <w:r>
-        <w:rPr>
-          <w:noProof/>
-        </w:rPr>
-        <w:fldChar w:fldCharType="begin"/>
-      </w:r>
-      <w:r>
-        <w:rPr>
-          <w:noProof/>
-        </w:rPr>
-        <w:instrText xml:space="preserve"> PAGEREF _Toc00000007 \h </w:instrText>
-      </w:r>
-      <w:r>
-        <w:rPr>
-          <w:noProof/>
-        </w:rPr>
-        <w:fldChar w:fldCharType="separate"/>
-      </w:r>
-      <w:r>
-        <w:rPr>
-          <w:noProof/>
-        </w:rPr>
-        <w:t>0</w:t>
-      </w:r>
-      <w:r>
-        <w:rPr>
-          <w:noProof/>
-        </w:rPr>
-        <w:fldChar w:fldCharType="end"/>
-      </w:r>
       <w:hyperlink w:anchor="_Toc00000007" w:history="1">
         <w:r>
           <w:rPr>
@@ -606,6 +576,36 @@
             <w:noProof/>
           </w:rPr>
           <w:tab/>
+        </w:r>
+        <w:r>
+          <w:rPr>
+            <w:noProof/>
+          </w:rPr>
+          <w:fldChar w:fldCharType="begin"/>
+        </w:r>
+        <w:r>
+          <w:rPr>
+            <w:noProof/>
+          </w:rPr>
+          <w:instrText xml:space="preserve"> PAGEREF _Toc00000007 \h </w:instrText>
+        </w:r>
+        <w:r>
+          <w:rPr>
+            <w:noProof/>
+          </w:rPr>
+          <w:fldChar w:fldCharType="separate"/>
+        </w:r>
+        <w:r>
+          <w:rPr>
+            <w:noProof/>
+          </w:rPr>
+          <w:t>0</w:t>
+        </w:r>
+        <w:r>
+          <w:rPr>
+            <w:noProof/>
+          </w:rPr>
+          <w:fldChar w:fldCharType="end"/>
         </w:r>
       </w:hyperlink>
     </w:p>
@@ -620,36 +620,6 @@
           <w:noProof/>
         </w:rPr>
       </w:pPr>
-      <w:r>
-        <w:rPr>
-          <w:noProof/>
-        </w:rPr>
-        <w:fldChar w:fldCharType="begin"/>
-      </w:r>
-      <w:r>
-        <w:rPr>
-          <w:noProof/>
-        </w:rPr>
-        <w:instrText xml:space="preserve"> PAGEREF _Toc00000008 \h </w:instrText>
-      </w:r>
-      <w:r>
-        <w:rPr>
-          <w:noProof/>
-        </w:rPr>
-        <w:fldChar w:fldCharType="separate"/>
-      </w:r>
-      <w:r>
-        <w:rPr>
-          <w:noProof/>
-        </w:rPr>
-        <w:t>0</w:t>
-      </w:r>
-      <w:r>
-        <w:rPr>
-          <w:noProof/>
-        </w:rPr>
-        <w:fldChar w:fldCharType="end"/>
-      </w:r>
       <w:hyperlink w:anchor="_Toc00000008" w:history="1">
         <w:r>
           <w:rPr>
@@ -662,6 +632,36 @@
             <w:noProof/>
           </w:rPr>
           <w:tab/>
+        </w:r>
+        <w:r>
+          <w:rPr>
+            <w:noProof/>
+          </w:rPr>
+          <w:fldChar w:fldCharType="begin"/>
+        </w:r>
+        <w:r>
+          <w:rPr>
+            <w:noProof/>
+          </w:rPr>
+          <w:instrText xml:space="preserve"> PAGEREF _Toc00000008 \h </w:instrText>
+        </w:r>
+        <w:r>
+          <w:rPr>
+            <w:noProof/>
+          </w:rPr>
+          <w:fldChar w:fldCharType="separate"/>
+        </w:r>
+        <w:r>
+          <w:rPr>
+            <w:noProof/>
+          </w:rPr>
+          <w:t>0</w:t>
+        </w:r>
+        <w:r>
+          <w:rPr>
+            <w:noProof/>
+          </w:rPr>
+          <w:fldChar w:fldCharType="end"/>
         </w:r>
       </w:hyperlink>
     </w:p>
@@ -676,39 +676,6 @@
           <w:noProof/>
         </w:rPr>
       </w:pPr>
-      <w:r>
-        <w:rPr>
-          <w:noProof/>
-        </w:rPr>
-        <w:fldChar w:fldCharType="begin"/>
-      </w:r>
-      <w:r>
-        <w:rPr>
-          <w:noProof/>
-        </w:rPr>
-        <w:instrText xml:space="preserve"> PAGEREF _Toc00000009 \h </w:instrText>
-      </w:r>
-      <w:r>
-        <w:rPr>
-          <w:noProof/>
-        </w:rPr>
-        <w:fldChar w:fldCharType="separate"/>
-      </w:r>
-      <w:r>
-        <w:rPr>
-          <w:noProof/>
-        </w:rPr>
-        <w:t>0</w:t>
-      </w:r>
-      <w:r>
-        <w:rPr>
-          <w:noProof/>
-        </w:rPr>
-        <w:fldChar w:fldCharType="end"/>
-      </w:r>
-      <w:r>
-        <w:fldChar w:fldCharType="end"/>
-      </w:r>
       <w:hyperlink w:anchor="_Toc00000009" w:history="1">
         <w:r>
           <w:rPr>
@@ -721,6 +688,39 @@
             <w:noProof/>
           </w:rPr>
           <w:tab/>
+        </w:r>
+        <w:r>
+          <w:rPr>
+            <w:noProof/>
+          </w:rPr>
+          <w:fldChar w:fldCharType="begin"/>
+        </w:r>
+        <w:r>
+          <w:rPr>
+            <w:noProof/>
+          </w:rPr>
+          <w:instrText xml:space="preserve"> PAGEREF _Toc00000009 \h </w:instrText>
+        </w:r>
+        <w:r>
+          <w:rPr>
+            <w:noProof/>
+          </w:rPr>
+          <w:fldChar w:fldCharType="separate"/>
+        </w:r>
+        <w:r>
+          <w:rPr>
+            <w:noProof/>
+          </w:rPr>
+          <w:t>0</w:t>
+        </w:r>
+        <w:r>
+          <w:rPr>
+            <w:noProof/>
+          </w:rPr>
+          <w:fldChar w:fldCharType="end"/>
+        </w:r>
+        <w:r>
+          <w:fldChar w:fldCharType="end"/>
         </w:r>
       </w:hyperlink>
     </w:p>

</xml_diff>

<commit_message>
fix(toc): close the TOC field outside the hyperlink (Word repair)
Word rejects a TOC field whose end character sits inside a w:hyperlink
('file damaged' prompt). Restore the canonical layout: the PAGEREF
field stays inside the hyperlink (so cached entries read
'Heading ..... 0'), but the TOC field's closing character is emitted
as a direct run after the last entry's hyperlink, exactly where Word
places it in its own generated TOCs.

Adds CT_P.HyperlinkFirst (xml:"-", following the CT_Body.ElemOrder
precedent) plus a custom CT_P.MarshalXML that keeps the default
runs-before-hyperlinks order for every other paragraph. The marshaler
also substitutes the canonical element name when Go's xml package
passes the type-name/empty fallback (XMLName is ignored for
xml.Marshaler types passed directly to Encode).
</commit_message>
<xml_diff>
--- a/examples/12-table-of-contents/output.docx
+++ b/examples/12-table-of-contents/output.docx
@@ -318,10 +318,10 @@
           </w:rPr>
           <w:fldChar w:fldCharType="end"/>
         </w:r>
-        <w:r>
-          <w:fldChar w:fldCharType="end"/>
-        </w:r>
       </w:hyperlink>
+      <w:r>
+        <w:fldChar w:fldCharType="end"/>
+      </w:r>
     </w:p>
     <w:p>
       <w:pPr>
@@ -719,10 +719,10 @@
           </w:rPr>
           <w:fldChar w:fldCharType="end"/>
         </w:r>
-        <w:r>
-          <w:fldChar w:fldCharType="end"/>
-        </w:r>
       </w:hyperlink>
+      <w:r>
+        <w:fldChar w:fldCharType="end"/>
+      </w:r>
     </w:p>
     <w:sectPr>
       <w:pgSz w:w="12240" w:h="15840"/>

</xml_diff>

<commit_message>
fix(fidelity): keep paragraph-mark run properties hoarded as Raw
Adding CT_PPr.RPr turned the paragraph-mark w:rPr from a hoarded Raw
element into a decoded struct, silently dropping attributes the WML
structs don't model (e.g. rFonts eastAsiaTheme/cstheme) and reordering
unknown children on every save — violating the library's fidelity
principle for real Word documents. Revert the field; TOC title and
entry paragraphs carry their visible formatting in run properties
instead of the paragraph mark. Refresh example outputs: all 12 examples
regenerate cleanly, and the only remaining diffs vs the committed
artifacts are the deterministic xmlns declaration order.
</commit_message>
<xml_diff>
--- a/examples/12-table-of-contents/output.docx
+++ b/examples/12-table-of-contents/output.docx
@@ -18,10 +18,6 @@
     <w:p>
       <w:pPr>
         <w:spacing w:before="240" w:after="120"/>
-        <w:rPr>
-          <w:b/>
-          <w:sz w:val="32"/>
-        </w:rPr>
       </w:pPr>
       <w:r>
         <w:fldChar w:fldCharType="begin" w:dirty="true"/>
@@ -47,9 +43,6 @@
         <w:tabs>
           <w:tab w:val="right" w:pos="9360" w:leader="dot"/>
         </w:tabs>
-        <w:rPr>
-          <w:noProof/>
-        </w:rPr>
       </w:pPr>
       <w:hyperlink w:anchor="_Toc00000000" w:history="1">
         <w:r>
@@ -103,9 +96,6 @@
         <w:tabs>
           <w:tab w:val="right" w:pos="9360" w:leader="dot"/>
         </w:tabs>
-        <w:rPr>
-          <w:noProof/>
-        </w:rPr>
       </w:pPr>
       <w:hyperlink w:anchor="_Toc00000001" w:history="1">
         <w:r>
@@ -159,9 +149,6 @@
         <w:tabs>
           <w:tab w:val="right" w:pos="9360" w:leader="dot"/>
         </w:tabs>
-        <w:rPr>
-          <w:noProof/>
-        </w:rPr>
       </w:pPr>
       <w:hyperlink w:anchor="_Toc00000002" w:history="1">
         <w:r>
@@ -215,9 +202,6 @@
         <w:tabs>
           <w:tab w:val="right" w:pos="9360" w:leader="dot"/>
         </w:tabs>
-        <w:rPr>
-          <w:noProof/>
-        </w:rPr>
       </w:pPr>
       <w:hyperlink w:anchor="_Toc00000003" w:history="1">
         <w:r>
@@ -271,9 +255,6 @@
         <w:tabs>
           <w:tab w:val="right" w:pos="9360" w:leader="dot"/>
         </w:tabs>
-        <w:rPr>
-          <w:noProof/>
-        </w:rPr>
       </w:pPr>
       <w:hyperlink w:anchor="_Toc00000004" w:history="1">
         <w:r>
@@ -419,10 +400,6 @@
     <w:p>
       <w:pPr>
         <w:spacing w:before="240" w:after="120"/>
-        <w:rPr>
-          <w:b/>
-          <w:sz w:val="32"/>
-        </w:rPr>
       </w:pPr>
       <w:r>
         <w:fldChar w:fldCharType="begin" w:dirty="true"/>
@@ -448,9 +425,6 @@
         <w:tabs>
           <w:tab w:val="right" w:pos="9360" w:leader="dot"/>
         </w:tabs>
-        <w:rPr>
-          <w:noProof/>
-        </w:rPr>
       </w:pPr>
       <w:hyperlink w:anchor="_Toc00000005" w:history="1">
         <w:r>
@@ -504,9 +478,6 @@
         <w:tabs>
           <w:tab w:val="right" w:pos="9360" w:leader="dot"/>
         </w:tabs>
-        <w:rPr>
-          <w:noProof/>
-        </w:rPr>
       </w:pPr>
       <w:hyperlink w:anchor="_Toc00000006" w:history="1">
         <w:r>
@@ -560,9 +531,6 @@
         <w:tabs>
           <w:tab w:val="right" w:pos="9360" w:leader="dot"/>
         </w:tabs>
-        <w:rPr>
-          <w:noProof/>
-        </w:rPr>
       </w:pPr>
       <w:hyperlink w:anchor="_Toc00000007" w:history="1">
         <w:r>
@@ -616,9 +584,6 @@
         <w:tabs>
           <w:tab w:val="right" w:pos="9360" w:leader="dot"/>
         </w:tabs>
-        <w:rPr>
-          <w:noProof/>
-        </w:rPr>
       </w:pPr>
       <w:hyperlink w:anchor="_Toc00000008" w:history="1">
         <w:r>
@@ -672,9 +637,6 @@
         <w:tabs>
           <w:tab w:val="right" w:pos="9360" w:leader="dot"/>
         </w:tabs>
-        <w:rPr>
-          <w:noProof/>
-        </w:rPr>
       </w:pPr>
       <w:hyperlink w:anchor="_Toc00000009" w:history="1">
         <w:r>

</xml_diff>